<commit_message>
court(ri): reply-brief gated on latex (spaced ellipsis), docx still reported for LibreOffice's footnote placement; amicus re-rendered on the model at HEAD (fb-595.54.76)
Co-Authored-By: Claude Opus 5.5 <noreply@anthropic.com>
</commit_message>
<xml_diff>
--- a/courts/first-circuit/rhode-island/state/supreme-court/amicus-brief/usage/OUTPUT-amicus-brief.docx
+++ b/courts/first-circuit/rhode-island/state/supreme-court/amicus-brief/usage/OUTPUT-amicus-brief.docx
@@ -2878,7 +2878,7 @@
         <w:pStyle w:val="BodyText"/>
       </w:pPr>
       <w:r>
-        <w:t xml:space="preserve">In furtherance of the national goals to protect vulnerable coastal resources, and in establishing a state regulatory process to manage Rhode Island’s own valuable coastal public trust resources, the Rhode Island legislature affirmed the critical importance of preserving the natural, commercial, industrial, recreational, and aesthetic coastal resources. The legislature recognized that destruction had already occurred and noted the increasing demands on our coastal resources. It sets forth Rhode Island’s policy of preserving and protecting our resources from poorly planned development, noting that “preservation and restoration of ecological systems shall be the primary guiding principle upon which environmental alteration of coastal resources will be measured, judged, and regulated.” R. I. Gen. Laws § 46- 23</w:t>
+        <w:t xml:space="preserve">In furtherance of the national goals to protect vulnerable coastal resources, and in establishing a state regulatory process to manage Rhode Island’s own valuable coastal public trust resources, the Rhode Island legislature affirmed the critical importance of preserving the natural, commercial, industrial, recreational, and aesthetic coastal resources. The legislature recognized that destruction had already occurred and noted the increasing demands on our coastal resources. It sets forth Rhode Island’s policy of preserving and protecting our resources from poorly planned development, noting that “preservation and restoration of ecological systems shall be the primary guiding principle upon which environmental alteration of coastal resources will be measured, judged, and regulated.” R. I. Gen. Laws § 46-⁠ 23</w:t>
       </w:r>
       <w:r>
         <w:noBreakHyphen/>
@@ -5064,19 +5064,7 @@
         <w:t xml:space="preserve"> </w:t>
       </w:r>
       <w:r>
-        <w:t xml:space="preserve">See, R.I Gen. Laws § 46</w:t>
-      </w:r>
-      <w:r>
-        <w:noBreakHyphen/>
-      </w:r>
-      <w:r>
-        <w:t xml:space="preserve">23</w:t>
-      </w:r>
-      <w:r>
-        <w:noBreakHyphen/>
-      </w:r>
-      <w:r>
-        <w:t xml:space="preserve">1 (a)-(c).</w:t>
+        <w:t xml:space="preserve">See, R.I Gen. Laws § 46-⁠23-⁠1 (a)-(c).</w:t>
       </w:r>
     </w:p>
   </w:footnote>
@@ -5247,31 +5235,7 @@
         <w:t xml:space="preserve"> </w:t>
       </w:r>
       <w:r>
-        <w:t xml:space="preserve">650 R.I. Code R. § 10</w:t>
-      </w:r>
-      <w:r>
-        <w:noBreakHyphen/>
-      </w:r>
-      <w:r>
-        <w:t xml:space="preserve">00</w:t>
-      </w:r>
-      <w:r>
-        <w:noBreakHyphen/>
-      </w:r>
-      <w:r>
-        <w:t xml:space="preserve">1.5; 650 R.I. Code R. § 20</w:t>
-      </w:r>
-      <w:r>
-        <w:noBreakHyphen/>
-      </w:r>
-      <w:r>
-        <w:t xml:space="preserve">00</w:t>
-      </w:r>
-      <w:r>
-        <w:noBreakHyphen/>
-      </w:r>
-      <w:r>
-        <w:t xml:space="preserve">1.5</w:t>
+        <w:t xml:space="preserve">650 R.I. Code R. § 10-⁠00-⁠1.5; 650 R.I. Code R. § 20-⁠00-⁠1.5</w:t>
       </w:r>
     </w:p>
   </w:footnote>
@@ -5300,7 +5264,7 @@
         <w:t xml:space="preserve"> </w:t>
       </w:r>
       <w:r>
-        <w:t xml:space="preserve">at § 1452(2)⁠(I); Coastal Zone Management Act Program Changes, NOAA, https://​​coast.​noaa.​gov/​​czmprogramchange/​​#/​​public/​​home (click “Learn About Program Changes”).</w:t>
+        <w:t xml:space="preserve">at § 1452(2)⁠(I); Coastal Zone Management Act Program Changes, NOAA, https://​coast.​noaa.​gov/​czmprogramchange/​#/​public/​home (click “Learn About Program Changes”).</w:t>
       </w:r>
     </w:p>
   </w:footnote>
@@ -5319,19 +5283,7 @@
         <w:t xml:space="preserve"> </w:t>
       </w:r>
       <w:r>
-        <w:t xml:space="preserve">650 R.I. Code R. § 10</w:t>
-      </w:r>
-      <w:r>
-        <w:noBreakHyphen/>
-      </w:r>
-      <w:r>
-        <w:t xml:space="preserve">00</w:t>
-      </w:r>
-      <w:r>
-        <w:noBreakHyphen/>
-      </w:r>
-      <w:r>
-        <w:t xml:space="preserve">1.</w:t>
+        <w:t xml:space="preserve">650 R.I. Code R. § 10-⁠00-⁠1.</w:t>
       </w:r>
     </w:p>
   </w:footnote>
@@ -5407,7 +5359,7 @@
         <w:t xml:space="preserve"> </w:t>
       </w:r>
       <w:r>
-        <w:t xml:space="preserve">650 R. I. Code R. § 20- 00</w:t>
+        <w:t xml:space="preserve">650 R. I. Code R. § 20-⁠ 00</w:t>
       </w:r>
       <w:r>
         <w:noBreakHyphen/>
@@ -5518,31 +5470,7 @@
         <w:t xml:space="preserve"> </w:t>
       </w:r>
       <w:r>
-        <w:t xml:space="preserve">650 R.I. Code R. § 10</w:t>
-      </w:r>
-      <w:r>
-        <w:noBreakHyphen/>
-      </w:r>
-      <w:r>
-        <w:t xml:space="preserve">00</w:t>
-      </w:r>
-      <w:r>
-        <w:noBreakHyphen/>
-      </w:r>
-      <w:r>
-        <w:t xml:space="preserve">1.5; 650 R.I. Code R. § 20</w:t>
-      </w:r>
-      <w:r>
-        <w:noBreakHyphen/>
-      </w:r>
-      <w:r>
-        <w:t xml:space="preserve">00</w:t>
-      </w:r>
-      <w:r>
-        <w:noBreakHyphen/>
-      </w:r>
-      <w:r>
-        <w:t xml:space="preserve">1.1.3 E.1.</w:t>
+        <w:t xml:space="preserve">650 R.I. Code R. § 10-⁠00-⁠1.5; 650 R.I. Code R. § 20-⁠00-⁠1.1.3 E.1.</w:t>
       </w:r>
     </w:p>
   </w:footnote>
@@ -6535,6 +6463,33 @@
     <w:pPr>
       <w:spacing w:before="0" w:after="0" w:line="322" w:lineRule="exact"/>
       <w:ind w:left="2160" w:hanging="720"/>
+    </w:pPr>
+  </w:style>
+  <w:style w:type="paragraph" w:customStyle="1" w:styleId="XdQuoteList1">
+    <w:name w:val="Xd Quote List 1"/>
+    <w:basedOn w:val="Normal"/>
+    <w:qFormat/>
+    <w:pPr>
+      <w:spacing w:before="0" w:after="0" w:line="644" w:lineRule="exact"/>
+      <w:ind w:left="1440" w:right="720" w:hanging="720"/>
+    </w:pPr>
+  </w:style>
+  <w:style w:type="paragraph" w:customStyle="1" w:styleId="XdQuoteList2">
+    <w:name w:val="Xd Quote List 2"/>
+    <w:basedOn w:val="Normal"/>
+    <w:qFormat/>
+    <w:pPr>
+      <w:spacing w:before="0" w:after="0" w:line="644" w:lineRule="exact"/>
+      <w:ind w:left="2160" w:right="720" w:hanging="720"/>
+    </w:pPr>
+  </w:style>
+  <w:style w:type="paragraph" w:customStyle="1" w:styleId="XdQuoteList3">
+    <w:name w:val="Xd Quote List 3"/>
+    <w:basedOn w:val="Normal"/>
+    <w:qFormat/>
+    <w:pPr>
+      <w:spacing w:before="0" w:after="0" w:line="644" w:lineRule="exact"/>
+      <w:ind w:left="2880" w:right="720" w:hanging="720"/>
     </w:pPr>
   </w:style>
   <w:style w:type="paragraph" w:customStyle="1" w:styleId="SourceCode">

</xml_diff>